<commit_message>
Give bid collection item descriptions more table space
</commit_message>
<xml_diff>
--- a/company_templates/Bid Document.docx
+++ b/company_templates/Bid Document.docx
@@ -330,21 +330,22 @@
         <w:tblW w:w="9900" w:type="dxa"/>
         <w:tblInd w:w="265" w:type="dxa"/>
         <w:tblLook w:val="04A0" w:firstRow="1" w:lastRow="0" w:firstColumn="1" w:lastColumn="0" w:noHBand="0" w:noVBand="1"/>
+        <w:tblLayout w:type="fixed"/>
       </w:tblPr>
       <w:tblGrid>
-        <w:gridCol w:w="2790"/>
-        <w:gridCol w:w="4019"/>
-        <w:gridCol w:w="3091"/>
+        <w:gridCol w:w="1188"/>
+        <w:gridCol w:w="6732"/>
+        <w:gridCol w:w="1980"/>
       </w:tblGrid>
       <w:tr>
         <w:tc>
           <w:tcPr>
-            <w:tcW w:w="2790" w:type="dxa"/>
+            <w:tcW w:w="1188" w:type="dxa"/>
           </w:tcPr>
           <w:p>
             <w:pPr>
               <w:pStyle w:val="NoSpacing"/>
-              <w:ind w:left="0" w:firstLine="0"/>
+              <w:ind w:left="0" w:firstLine="0" w:right="0"/>
               <w:jc w:val="center"/>
               <w:rPr>
                 <w:b/>
@@ -362,12 +363,12 @@
         </w:tc>
         <w:tc>
           <w:tcPr>
-            <w:tcW w:w="4019" w:type="dxa"/>
+            <w:tcW w:w="6732" w:type="dxa"/>
           </w:tcPr>
           <w:p>
             <w:pPr>
               <w:pStyle w:val="NoSpacing"/>
-              <w:ind w:left="0" w:firstLine="0"/>
+              <w:ind w:left="0" w:firstLine="0" w:right="0"/>
               <w:jc w:val="center"/>
               <w:rPr>
                 <w:b/>
@@ -385,12 +386,12 @@
         </w:tc>
         <w:tc>
           <w:tcPr>
-            <w:tcW w:w="3091" w:type="dxa"/>
+            <w:tcW w:w="1980" w:type="dxa"/>
           </w:tcPr>
           <w:p>
             <w:pPr>
               <w:pStyle w:val="NoSpacing"/>
-              <w:ind w:left="0" w:firstLine="0"/>
+              <w:ind w:left="0" w:firstLine="0" w:right="0"/>
               <w:jc w:val="center"/>
               <w:rPr>
                 <w:b/>
@@ -413,12 +414,12 @@
         </w:trPr>
         <w:tc>
           <w:tcPr>
-            <w:tcW w:w="2790" w:type="dxa"/>
+            <w:tcW w:w="1188" w:type="dxa"/>
           </w:tcPr>
           <w:p>
             <w:pPr>
               <w:pStyle w:val="NoSpacing"/>
-              <w:ind w:left="0" w:firstLine="0"/>
+              <w:ind w:left="0" w:firstLine="0" w:right="0"/>
               <w:jc w:val="left"/>
             </w:pPr>
             <w:r>
@@ -436,23 +437,23 @@
         </w:tc>
         <w:tc>
           <w:tcPr>
-            <w:tcW w:w="4019" w:type="dxa"/>
+            <w:tcW w:w="6732" w:type="dxa"/>
           </w:tcPr>
           <w:p>
             <w:pPr>
               <w:pStyle w:val="NoSpacing"/>
-              <w:ind w:left="0" w:firstLine="0"/>
+              <w:ind w:left="0" w:firstLine="0" w:right="0"/>
             </w:pPr>
           </w:p>
         </w:tc>
         <w:tc>
           <w:tcPr>
-            <w:tcW w:w="3091" w:type="dxa"/>
+            <w:tcW w:w="1980" w:type="dxa"/>
           </w:tcPr>
           <w:p>
             <w:pPr>
               <w:pStyle w:val="NoSpacing"/>
-              <w:ind w:left="0" w:firstLine="0"/>
+              <w:ind w:left="0" w:firstLine="0" w:right="0"/>
               <w:jc w:val="right"/>
             </w:pPr>
           </w:p>
@@ -461,12 +462,12 @@
       <w:tr>
         <w:tc>
           <w:tcPr>
-            <w:tcW w:w="2790" w:type="dxa"/>
+            <w:tcW w:w="1188" w:type="dxa"/>
           </w:tcPr>
           <w:p>
             <w:pPr>
               <w:pStyle w:val="NoSpacing"/>
-              <w:ind w:left="0" w:firstLine="0"/>
+              <w:ind w:left="0" w:firstLine="0" w:right="0"/>
               <w:jc w:val="left"/>
             </w:pPr>
             <w:proofErr w:type="gramStart"/>
@@ -489,12 +490,12 @@
         </w:tc>
         <w:tc>
           <w:tcPr>
-            <w:tcW w:w="4019" w:type="dxa"/>
+            <w:tcW w:w="6732" w:type="dxa"/>
           </w:tcPr>
           <w:p>
             <w:pPr>
               <w:pStyle w:val="NoSpacing"/>
-              <w:ind w:left="0" w:firstLine="0"/>
+              <w:ind w:left="0" w:firstLine="0" w:right="0"/>
             </w:pPr>
             <w:proofErr w:type="gramStart"/>
             <w:r>
@@ -516,12 +517,12 @@
         </w:tc>
         <w:tc>
           <w:tcPr>
-            <w:tcW w:w="3091" w:type="dxa"/>
+            <w:tcW w:w="1980" w:type="dxa"/>
           </w:tcPr>
           <w:p>
             <w:pPr>
               <w:pStyle w:val="NoSpacing"/>
-              <w:ind w:left="0" w:firstLine="0"/>
+              <w:ind w:left="0" w:firstLine="0" w:right="0"/>
               <w:jc w:val="right"/>
             </w:pPr>
             <w:proofErr w:type="gramStart"/>
@@ -546,12 +547,12 @@
       <w:tr>
         <w:tc>
           <w:tcPr>
-            <w:tcW w:w="2790" w:type="dxa"/>
+            <w:tcW w:w="1188" w:type="dxa"/>
           </w:tcPr>
           <w:p>
             <w:pPr>
               <w:pStyle w:val="NoSpacing"/>
-              <w:ind w:left="0" w:firstLine="0"/>
+              <w:ind w:left="0" w:firstLine="0" w:right="0"/>
               <w:jc w:val="left"/>
             </w:pPr>
             <w:r>
@@ -569,23 +570,23 @@
         </w:tc>
         <w:tc>
           <w:tcPr>
-            <w:tcW w:w="4019" w:type="dxa"/>
+            <w:tcW w:w="6732" w:type="dxa"/>
           </w:tcPr>
           <w:p>
             <w:pPr>
               <w:pStyle w:val="NoSpacing"/>
-              <w:ind w:left="0" w:firstLine="0"/>
+              <w:ind w:left="0" w:firstLine="0" w:right="0"/>
             </w:pPr>
           </w:p>
         </w:tc>
         <w:tc>
           <w:tcPr>
-            <w:tcW w:w="3091" w:type="dxa"/>
+            <w:tcW w:w="1980" w:type="dxa"/>
           </w:tcPr>
           <w:p>
             <w:pPr>
               <w:pStyle w:val="NoSpacing"/>
-              <w:ind w:left="0" w:firstLine="0"/>
+              <w:ind w:left="0" w:firstLine="0" w:right="0"/>
               <w:jc w:val="right"/>
             </w:pPr>
           </w:p>

</xml_diff>